<commit_message>
Add U16 U17 groups and coach player notes
</commit_message>
<xml_diff>
--- a/public/templates/champion-import-template.docx
+++ b/public/templates/champion-import-template.docx
@@ -966,7 +966,7 @@
         <w:spacing w:after="200"/>
       </w:pPr>
       <w:r>
-        <w:t>Одинадцять прикладів: 4 тести й 5 полів результату для U6–U12; 4 тести й 6 полів для U13–U15. Тест 505 має поля справа і зліва; для стрибка в довжину вноситься лише краща спроба; для Yo-Yo IR1 — дистанція у метрах. Воротарі 9–12 років використовують молодший набір, воротарі 13–17 — старший; потрібен рік або дата народження.</w:t>
+        <w:t>Одинадцять прикладів: 4 тести й 5 полів результату для U6–U12; 4 тести й 6 полів для U13–U17. Тест 505 має поля справа і зліва; для стрибка в довжину вноситься лише краща спроба; для Yo-Yo IR1 — дистанція у метрах. Воротарі 9–12 років використовують молодший набір, воротарі 13–17 — старший; потрібен рік або дата народження.</w:t>
       </w:r>
     </w:p>
     <w:tbl>
@@ -2222,7 +2222,7 @@
                 <w:color w:val="5F5F5F"/>
                 <w:sz w:val="13"/>
               </w:rPr>
-              <w:t>ПРИКЛАД — U14A</w:t>
+              <w:t>ПРИКЛАД — U16A</w:t>
             </w:r>
           </w:p>
         </w:tc>
@@ -2375,7 +2375,7 @@
                 <w:color w:val="5F5F5F"/>
                 <w:sz w:val="13"/>
               </w:rPr>
-              <w:t>ПРИКЛАД — U14A</w:t>
+              <w:t>ПРИКЛАД — U16A</w:t>
             </w:r>
           </w:p>
         </w:tc>
@@ -2528,7 +2528,7 @@
                 <w:color w:val="5F5F5F"/>
                 <w:sz w:val="13"/>
               </w:rPr>
-              <w:t>ПРИКЛАД — U14A</w:t>
+              <w:t>ПРИКЛАД — U16A</w:t>
             </w:r>
           </w:p>
         </w:tc>
@@ -2681,7 +2681,7 @@
                 <w:color w:val="5F5F5F"/>
                 <w:sz w:val="13"/>
               </w:rPr>
-              <w:t>ПРИКЛАД — U14A</w:t>
+              <w:t>ПРИКЛАД — U16A</w:t>
             </w:r>
           </w:p>
         </w:tc>
@@ -2834,7 +2834,7 @@
                 <w:color w:val="5F5F5F"/>
                 <w:sz w:val="13"/>
               </w:rPr>
-              <w:t>ПРИКЛАД — U14A</w:t>
+              <w:t>ПРИКЛАД — U16A</w:t>
             </w:r>
           </w:p>
         </w:tc>
@@ -2987,7 +2987,7 @@
                 <w:color w:val="5F5F5F"/>
                 <w:sz w:val="13"/>
               </w:rPr>
-              <w:t>ПРИКЛАД — U14A</w:t>
+              <w:t>ПРИКЛАД — U16A</w:t>
             </w:r>
           </w:p>
         </w:tc>
@@ -8384,7 +8384,7 @@
                 <w:color w:val="111111"/>
                 <w:sz w:val="11"/>
               </w:rPr>
-              <w:t>U13–U15</w:t>
+              <w:t>U13–U17</w:t>
             </w:r>
           </w:p>
         </w:tc>
@@ -8537,7 +8537,7 @@
                 <w:color w:val="111111"/>
                 <w:sz w:val="11"/>
               </w:rPr>
-              <w:t>U13–U15</w:t>
+              <w:t>U13–U17</w:t>
             </w:r>
           </w:p>
         </w:tc>
@@ -8690,7 +8690,7 @@
                 <w:color w:val="111111"/>
                 <w:sz w:val="11"/>
               </w:rPr>
-              <w:t>U13–U15</w:t>
+              <w:t>U13–U17</w:t>
             </w:r>
           </w:p>
         </w:tc>
@@ -8843,7 +8843,7 @@
                 <w:color w:val="111111"/>
                 <w:sz w:val="11"/>
               </w:rPr>
-              <w:t>U13–U15</w:t>
+              <w:t>U13–U17</w:t>
             </w:r>
           </w:p>
         </w:tc>
@@ -8996,7 +8996,7 @@
                 <w:color w:val="111111"/>
                 <w:sz w:val="11"/>
               </w:rPr>
-              <w:t>U13–U15</w:t>
+              <w:t>U13–U17</w:t>
             </w:r>
           </w:p>
         </w:tc>
@@ -9149,7 +9149,7 @@
                 <w:color w:val="111111"/>
                 <w:sz w:val="11"/>
               </w:rPr>
-              <w:t>U13–U15</w:t>
+              <w:t>U13–U17</w:t>
             </w:r>
           </w:p>
         </w:tc>

</xml_diff>